<commit_message>
Accurate CRediT and generative-AI statements, KLI wording, GRRAS layout
- Contributions and AI declaration now describe exactly what the author did and what was done
  with generative AI, after the SportRxiv rejection (submission 1123).
- KLI described as tracking kick intensity in the laboratory, not as validated.
- GRRAS checklist: the table breaks across pages instead of overlapping; gap handling stated.

Co-Authored-By: Claude Opus 5.5 <noreply@anthropic.com>
</commit_message>
<xml_diff>
--- a/docs/manuscrito/cover_letter.docx
+++ b/docs/manuscrito/cover_letter.docx
@@ -134,7 +134,7 @@
         </w:numPr>
       </w:pPr>
       <w:r>
-        <w:t xml:space="preserve">A swing-leg Kick Load Index was valid in the laboratory but not recoverable from broadcast-like video. Validating it as an injury predictor would therefore need about 590 kicking-related injuries, 12–24 seasons of the whole league, against 48 with a laboratory-grade measurement — a quantitative argument for raising measurement reliability before any prospective injury study.</w:t>
+        <w:t xml:space="preserve">A swing-leg Kick Load Index tracked kick intensity in the laboratory but was not recoverable from broadcast-like video. Validating it as an injury predictor would therefore need about 590 kicking-related injuries, 12–24 seasons of the whole league, against 48 with a laboratory-grade measurement — a quantitative argument for raising measurement reliability before any prospective injury study.</w:t>
       </w:r>
     </w:p>
     <w:p>
@@ -143,6 +143,28 @@
       </w:pPr>
       <w:r>
         <w:t xml:space="preserve">The methods were chosen to support these conclusions without overstating them. Ground truth comes from optical motion capture of 90 kicks, and the error model is the real detector error measured on broadcast shots, not idealised noise. The simulation is tested against real video with synchronised capture and a per-recording digital twin (r = 0.84). Agreement is reported following GRRAS, with equivalence tests and statistical parametric mapping. A field example with the author’s own ball kicks filmed by smartphone shows the same patterns on real football kicks. Limitations are stated explicitly, in particular that most reference kicks are laboratory air kicks. All code and the broadcast residual bank are openly available (https://github.com/convderover/broadcast-kick-biomechanics; Zenodo DOI</w:t>
+      </w:r>
+      <w:r>
+        <w:t xml:space="preserve"> </w:t>
+      </w:r>
+      <w:hyperlink r:id="rId9">
+        <w:r>
+          <w:rPr>
+            <w:rStyle w:val="Hyperlink"/>
+          </w:rPr>
+          <w:t xml:space="preserve">10.5281/zenodo.23439408</w:t>
+        </w:r>
+      </w:hyperlink>
+      <w:r>
+        <w:t xml:space="preserve">), and the complete statistical outputs and the GRRAS checklist are provided as supplementary files.</w:t>
+      </w:r>
+    </w:p>
+    <w:p>
+      <w:pPr>
+        <w:pStyle w:val="BodyText"/>
+      </w:pPr>
+      <w:r>
+        <w:t xml:space="preserve">In line with Taylor &amp; Francis policy, a preprint of this manuscript has been posted at</w:t>
       </w:r>
       <w:r>
         <w:t xml:space="preserve"> </w:t>
@@ -152,31 +174,10 @@
           <w:b/>
           <w:bCs/>
         </w:rPr>
-        <w:t xml:space="preserve">[PENDING]</w:t>
-      </w:r>
-      <w:r>
-        <w:t xml:space="preserve">), and the complete statistical outputs and the GRRAS checklist are provided as supplementary files.</w:t>
-      </w:r>
-    </w:p>
-    <w:p>
-      <w:pPr>
-        <w:pStyle w:val="BodyText"/>
-      </w:pPr>
-      <w:r>
-        <w:t xml:space="preserve">In line with Taylor &amp; Francis policy, a preprint of this manuscript has been posted on SportRxiv (DOI</w:t>
-      </w:r>
-      <w:r>
-        <w:t xml:space="preserve"> </w:t>
-      </w:r>
-      <w:r>
-        <w:rPr>
-          <w:b/>
-          <w:bCs/>
-        </w:rPr>
-        <w:t xml:space="preserve">[PENDING]</w:t>
-      </w:r>
-      <w:r>
-        <w:t xml:space="preserve">). The study is a secondary analysis of public datasets and was not pre-registered. The use of generative AI as an assistant for code, analysis, figures and drafting is declared in the manuscript.</w:t>
+        <w:t xml:space="preserve">[PENDING: preprint server and DOI]</w:t>
+      </w:r>
+      <w:r>
+        <w:t xml:space="preserve">. The study is a secondary analysis of public datasets and was not pre-registered. The extensive use of generative AI (study design proposals, code, analyses, figures and drafting) is declared in detail in the manuscript, and all code and outputs are public.</w:t>
       </w:r>
     </w:p>
     <w:p>

</xml_diff>

<commit_message>
fix: align project with published SportRxiv preprint
</commit_message>
<xml_diff>
--- a/docs/manuscrito/cover_letter.docx
+++ b/docs/manuscrito/cover_letter.docx
@@ -15,11 +15,7 @@
         <w:pStyle w:val="Date"/>
       </w:pPr>
       <w:r>
-        <w:rPr>
-          <w:b/>
-          <w:bCs/>
-        </w:rPr>
-        <w:t xml:space="preserve">[PENDING: submission date]</w:t>
+        <w:t xml:space="preserve">Draft updated 26 October 2026; submission date to be set</w:t>
       </w:r>
     </w:p>
     <w:p>
@@ -110,7 +106,7 @@
         </w:numPr>
       </w:pPr>
       <w:r>
-        <w:t xml:space="preserve">From a single broadcast camera, none of six kinematic features or three swing-leg joint moments met literature-based acceptability criteria for any of the three uses. The detector error on 200 Premier League shots was 7.6–12.9 % of player height.</w:t>
+        <w:t xml:space="preserve">From a single broadcast camera, none of six kinematic features or three swing-leg joint moments met exploratory operational criteria informed by the literature for any of the three uses. The detector error on 200 Premier League shots was 7.6–12.9 % of player height.</w:t>
       </w:r>
     </w:p>
     <w:p>
@@ -122,7 +118,7 @@
         </w:numPr>
       </w:pPr>
       <w:r>
-        <w:t xml:space="preserve">Fusing the replay angles a broadcast already shows, with a laboratory-learnt correction, made kicking-knee flexion acceptable for ranking players and trunk leans comparable with laboratory norms. Knowing the contact instant, as the connected ball provides, reduced errors by a quarter; frame rate did not matter.</w:t>
+        <w:t xml:space="preserve">Three simulated replays with laboratory correction met selected exploratory criteria for between-participant ranking of knee flexion and laboratory comparison of trunk leans. Reference contact timing reduced error by about a quarter relative to reconstructed automatic timing; no connected-ball sensor or synchronisation was evaluated. The tested 25-versus-50-fps contrast did not improve error in this experiment.</w:t>
       </w:r>
     </w:p>
     <w:p>
@@ -134,7 +130,7 @@
         </w:numPr>
       </w:pPr>
       <w:r>
-        <w:t xml:space="preserve">A swing-leg Kick Load Index tracked kick intensity in the laboratory but was not recoverable from broadcast-like video. Validating it as an injury predictor would therefore need about 590 kicking-related injuries, 12–24 seasons of the whole league, against 48 with a laboratory-grade measurement — a quantitative argument for raising measurement reliability before any prospective injury study.</w:t>
+        <w:t xml:space="preserve">The laboratory KLI association with ankle speed (ρ = 0.79) is a within-model consistency check with shared kinematic input. Broadcast agreement was poor (ICC 0.090; calibration slope b = 0.081). These slopes do not estimate reliability; the earlier KLI-specific event counts and league-season extrapolations are withdrawn. Only independent hypothetical information fractions are used for event-count sensitivity; no injury outcomes or injury-risk validity were assessed.</w:t>
       </w:r>
     </w:p>
     <w:p>
@@ -142,7 +138,7 @@
         <w:pStyle w:val="FirstParagraph"/>
       </w:pPr>
       <w:r>
-        <w:t xml:space="preserve">The methods were chosen to support these conclusions without overstating them. Ground truth comes from optical motion capture of 90 kicks, and the error model is the real detector error measured on broadcast shots, not idealised noise. The simulation is tested against real video with synchronised capture and a per-recording digital twin (r = 0.84). Agreement is reported following GRRAS, with equivalence tests and statistical parametric mapping. A field example with the author’s own ball kicks filmed by smartphone shows the same patterns on real football kicks. Limitations are stated explicitly, in particular that most reference kicks are laboratory air kicks. All code and the broadcast residual bank are openly available (https://github.com/convderover/broadcast-kick-biomechanics; Zenodo DOI</w:t>
+        <w:t xml:space="preserve">Reference data comprise seven CMU ball kicks from two people and 83 MoVi air kicks. Real-video validation uses 162 recordings from 82 MoVi participants, with a per-recording digital twin (aggregate error association r = 0.84). Agreement is reported following GRRAS, with equivalence tests and a custom paired sign-flip waveform permutation procedure, not the spm1d package. Scale, alignment, kicking leg and known contact use reference information in the main conditions. Thirteen smartphone recordings of the author’s own kicks illustrate the pipeline without a reference measurement. The criteria are exploratory and do not establish individual clinical, sporting or injury-risk validity. Code and the broadcast residual bank are openly available (https://github.com/convderover/broadcast-kick-biomechanics; Zenodo DOI</w:t>
       </w:r>
       <w:r>
         <w:t xml:space="preserve"> </w:t>
@@ -156,7 +152,7 @@
         </w:r>
       </w:hyperlink>
       <w:r>
-        <w:t xml:space="preserve">), and the complete statistical outputs and the GRRAS checklist are provided as supplementary files.</w:t>
+        <w:t xml:space="preserve">); the statistical outputs and GRRAS checklist accompany the repository.</w:t>
       </w:r>
     </w:p>
     <w:p>
@@ -164,20 +160,18 @@
         <w:pStyle w:val="BodyText"/>
       </w:pPr>
       <w:r>
-        <w:t xml:space="preserve">In line with Taylor &amp; Francis policy, a preprint of this manuscript has been posted at</w:t>
-      </w:r>
-      <w:r>
-        <w:t xml:space="preserve"> </w:t>
-      </w:r>
-      <w:r>
-        <w:rPr>
-          <w:b/>
-          <w:bCs/>
-        </w:rPr>
-        <w:t xml:space="preserve">[PENDING: preprint server and DOI]</w:t>
-      </w:r>
-      <w:r>
-        <w:t xml:space="preserve">. The study is a secondary analysis of public datasets and was not pre-registered. The extensive use of generative AI (study design proposals, code, analyses, figures and drafting) is declared in detail in the manuscript, and all code and outputs are public.</w:t>
+        <w:t xml:space="preserve">A preprint was published on SportRxiv on 26 October 2026 (</w:t>
+      </w:r>
+      <w:hyperlink r:id="rId10">
+        <w:r>
+          <w:rPr>
+            <w:rStyle w:val="Hyperlink"/>
+          </w:rPr>
+          <w:t xml:space="preserve">DOI 10.51224/SportRxiv.1131</w:t>
+        </w:r>
+      </w:hyperlink>
+      <w:r>
+        <w:t xml:space="preserve">); it has not been peer reviewed. This is an unsent cover-letter draft, not evidence of submission or acceptance. The study is a secondary analysis of public datasets and was not pre-registered. The extensive use of generative AI (study design proposals, code, analyses, figures and drafting) is declared in detail in the manuscript, and all code and outputs are public.</w:t>
       </w:r>
     </w:p>
     <w:p>

</xml_diff>